<commit_message>
docs(report): update sampled experiment report draft
</commit_message>
<xml_diff>
--- a/experiments/qwen3_vl_1000_sample_final_report_draft.docx
+++ b/experiments/qwen3_vl_1000_sample_final_report_draft.docx
@@ -3837,13 +3837,26 @@
             <w:pPr>
               <w:spacing w:line="252" w:lineRule="auto"/>
               <w:jc w:val="center"/>
+              <w:rPr>
+                <w:rFonts w:hint="eastAsia"/>
+                <w:lang w:eastAsia="ko-KR"/>
+              </w:rPr>
             </w:pPr>
             <w:r>
               <w:rPr>
                 <w:color w:val="222222"/>
                 <w:sz w:val="19"/>
               </w:rPr>
-              <w:t>1.12</w:t>
+              <w:t>1.</w:t>
+            </w:r>
+            <w:r>
+              <w:rPr>
+                <w:rFonts w:hint="eastAsia"/>
+                <w:color w:val="222222"/>
+                <w:sz w:val="19"/>
+                <w:lang w:eastAsia="ko-KR"/>
+              </w:rPr>
+              <w:t>9625</w:t>
             </w:r>
           </w:p>
         </w:tc>
@@ -3868,7 +3881,23 @@
                 <w:color w:val="222222"/>
                 <w:sz w:val="19"/>
               </w:rPr>
-              <w:t>0.35</w:t>
+              <w:t>0.</w:t>
+            </w:r>
+            <w:r>
+              <w:rPr>
+                <w:rFonts w:hint="eastAsia"/>
+                <w:color w:val="222222"/>
+                <w:sz w:val="19"/>
+                <w:lang w:eastAsia="ko-KR"/>
+              </w:rPr>
+              <w:t>1</w:t>
+            </w:r>
+            <w:r>
+              <w:rPr>
+                <w:color w:val="222222"/>
+                <w:sz w:val="19"/>
+              </w:rPr>
+              <w:t>5</w:t>
             </w:r>
           </w:p>
         </w:tc>
@@ -3893,7 +3922,23 @@
                 <w:color w:val="222222"/>
                 <w:sz w:val="19"/>
               </w:rPr>
-              <w:t>0.44</w:t>
+              <w:t>0.</w:t>
+            </w:r>
+            <w:r>
+              <w:rPr>
+                <w:rFonts w:hint="eastAsia"/>
+                <w:color w:val="222222"/>
+                <w:sz w:val="19"/>
+                <w:lang w:eastAsia="ko-KR"/>
+              </w:rPr>
+              <w:t>1</w:t>
+            </w:r>
+            <w:r>
+              <w:rPr>
+                <w:color w:val="222222"/>
+                <w:sz w:val="19"/>
+              </w:rPr>
+              <w:t>4</w:t>
             </w:r>
           </w:p>
         </w:tc>
@@ -4316,7 +4361,21 @@
         <w:rPr>
           <w:color w:val="222222"/>
         </w:rPr>
-        <w:t>, OCR+Qwen merged evidence는 Qwen-only 대비 hallucination을 일부 줄이며 identifier exact match를 소폭 개선했다. 즉 OCR은 ‘기본 검색 엔진’보다는 ‘보조 검증 신호’로 사용할 때 가치가 크다.</w:t>
+        <w:t xml:space="preserve">, </w:t>
+      </w:r>
+      <w:proofErr w:type="spellStart"/>
+      <w:r>
+        <w:rPr>
+          <w:color w:val="222222"/>
+        </w:rPr>
+        <w:t>OCR+Qwen</w:t>
+      </w:r>
+      <w:proofErr w:type="spellEnd"/>
+      <w:r>
+        <w:rPr>
+          <w:color w:val="222222"/>
+        </w:rPr>
+        <w:t xml:space="preserve"> merged evidence는 Qwen-only 대비 hallucination을 일부 줄이며 identifier exact match를 소폭 개선했다. 즉 OCR은 ‘기본 검색 엔진’보다는 ‘보조 검증 신호’로 사용할 때 가치가 크다.</w:t>
       </w:r>
     </w:p>
     <w:p>

</xml_diff>